<commit_message>
Study-guide links: every 'Also tested' line now sits in the section that teaches it
Eight eye-drop vasoconstrictor lines were filed under Bile acid sequestrants (Pharm Exam 2), so the 'Find it in the study guide' button sent ocular questions to the lipid section. A measured scan of all 2,870 guide additions found 96 more lines under a section that did not teach them (CMS 1-4, Clin Path, Med Lit, Micro, Pharm 1, PD2, PDM). Each was re-placed by an independent reviewer; section titles refreshed, links rebuilt, audit re-run (strict passes: 9,309/9,309), Word copies rebuilt. One Micro fomite question now links to the fomite line directly.

Co-Authored-By: Claude Sonnet 5.5 <noreply@anthropic.com>
</commit_message>
<xml_diff>
--- a/Clinical Pathophysiology I Exam 1/cp-exam-1-study-guide.docx
+++ b/Clinical Pathophysiology I Exam 1/cp-exam-1-study-guide.docx
@@ -18099,6 +18099,28 @@
           <w:i w:val="0"/>
           <w:sz w:val="20"/>
         </w:rPr>
+        <w:t>Protooncogene mutation.</w:t>
+      </w:r>
+      <w:r>
+        <w:rPr>
+          <w:b w:val="0"/>
+          <w:i w:val="0"/>
+          <w:sz w:val="20"/>
+        </w:rPr>
+        <w:t xml:space="preserve"> Mutation converts a protooncogene into an oncogene, which encodes oncoproteins that promote continued growth in an uncontrolled manner.</w:t>
+      </w:r>
+    </w:p>
+    <w:p>
+      <w:pPr>
+        <w:pStyle w:val="ListBullet"/>
+        <w:spacing w:after="40"/>
+      </w:pPr>
+      <w:r>
+        <w:rPr>
+          <w:b/>
+          <w:i w:val="0"/>
+          <w:sz w:val="20"/>
+        </w:rPr>
         <w:t>Genes for self-destruction of damaged cells.</w:t>
       </w:r>
       <w:r>
@@ -19827,28 +19849,6 @@
           <w:i w:val="0"/>
         </w:rPr>
         <w:t>Also tested</w:t>
-      </w:r>
-    </w:p>
-    <w:p>
-      <w:pPr>
-        <w:pStyle w:val="ListBullet"/>
-        <w:spacing w:after="40"/>
-      </w:pPr>
-      <w:r>
-        <w:rPr>
-          <w:b/>
-          <w:i w:val="0"/>
-          <w:sz w:val="20"/>
-        </w:rPr>
-        <w:t>Protooncogene mutation.</w:t>
-      </w:r>
-      <w:r>
-        <w:rPr>
-          <w:b w:val="0"/>
-          <w:i w:val="0"/>
-          <w:sz w:val="20"/>
-        </w:rPr>
-        <w:t xml:space="preserve"> Mutation converts a protooncogene into an oncogene, which encodes oncoproteins that promote continued growth in an uncontrolled manner.</w:t>
       </w:r>
     </w:p>
     <w:p>
@@ -22194,6 +22194,28 @@
           <w:i w:val="0"/>
           <w:sz w:val="20"/>
         </w:rPr>
+        <w:t>Herpes simplex epithelial keratitis.</w:t>
+      </w:r>
+      <w:r>
+        <w:rPr>
+          <w:b w:val="0"/>
+          <w:i w:val="0"/>
+          <w:sz w:val="20"/>
+        </w:rPr>
+        <w:t xml:space="preserve"> The classical lesion is a branching dendritic corneal ulcer whose tips end in terminal bulbs on fluorescein stain.</w:t>
+      </w:r>
+    </w:p>
+    <w:p>
+      <w:pPr>
+        <w:pStyle w:val="ListBullet"/>
+        <w:spacing w:after="40"/>
+      </w:pPr>
+      <w:r>
+        <w:rPr>
+          <w:b/>
+          <w:i w:val="0"/>
+          <w:sz w:val="20"/>
+        </w:rPr>
         <w:t>Outermost ocular structures.</w:t>
       </w:r>
       <w:r>
@@ -27591,7 +27613,7 @@
           <w:i w:val="0"/>
           <w:sz w:val="20"/>
         </w:rPr>
-        <w:t>Chalazion.</w:t>
+        <w:t>Protection of the outer ear canal.</w:t>
       </w:r>
       <w:r>
         <w:rPr>
@@ -27599,7 +27621,7 @@
           <w:i w:val="0"/>
           <w:sz w:val="20"/>
         </w:rPr>
-        <w:t xml:space="preserve"> A chalazion is a non-tender, sterile lipogranuloma of a blocked meibomian gland; being sterile and granulomatous is what separates it from an infection.</w:t>
+        <w:t xml:space="preserve"> The outer third of the ear canal is protected by cerumen from ceruminous glands and by hair follicles.</w:t>
       </w:r>
     </w:p>
     <w:p>
@@ -27613,7 +27635,7 @@
           <w:i w:val="0"/>
           <w:sz w:val="20"/>
         </w:rPr>
-        <w:t>Herpes simplex epithelial keratitis.</w:t>
+        <w:t>Chalazion.</w:t>
       </w:r>
       <w:r>
         <w:rPr>
@@ -27621,7 +27643,29 @@
           <w:i w:val="0"/>
           <w:sz w:val="20"/>
         </w:rPr>
-        <w:t xml:space="preserve"> The classical lesion is a branching dendritic corneal ulcer whose tips end in terminal bulbs on fluorescein stain.</w:t>
+        <w:t xml:space="preserve"> A chalazion is a non-tender, sterile lipogranuloma of a blocked meibomian gland; being sterile and granulomatous is what separates it from an infection.</w:t>
+      </w:r>
+    </w:p>
+    <w:p>
+      <w:pPr>
+        <w:pStyle w:val="ListBullet"/>
+        <w:spacing w:after="40"/>
+      </w:pPr>
+      <w:r>
+        <w:rPr>
+          <w:b/>
+          <w:i w:val="0"/>
+          <w:sz w:val="20"/>
+        </w:rPr>
+        <w:t>Tympanic membrane.</w:t>
+      </w:r>
+      <w:r>
+        <w:rPr>
+          <w:b w:val="0"/>
+          <w:i w:val="0"/>
+          <w:sz w:val="20"/>
+        </w:rPr>
+        <w:t xml:space="preserve"> The tympanic membrane separates the external ear from the middle ear and is the first moving part of the conducting chain, vibrating the ossicles; perforating it causes conductive loss.</w:t>
       </w:r>
     </w:p>
     <w:p>
@@ -30958,7 +31002,7 @@
           <w:i w:val="0"/>
           <w:sz w:val="20"/>
         </w:rPr>
-        <w:t>Protection of the outer ear canal.</w:t>
+        <w:t>Fungal otitis externa.</w:t>
       </w:r>
       <w:r>
         <w:rPr>
@@ -30966,7 +31010,7 @@
           <w:i w:val="0"/>
           <w:sz w:val="20"/>
         </w:rPr>
-        <w:t xml:space="preserve"> The outer third of the ear canal is protected by cerumen from ceruminous glands and by hair follicles.</w:t>
+        <w:t xml:space="preserve"> Prolonged antibiotic use suppresses the bacteria, and Aspergillus niger or Candida albicans then take over as fungal otitis externa.</w:t>
       </w:r>
     </w:p>
     <w:p>
@@ -30980,7 +31024,7 @@
           <w:i w:val="0"/>
           <w:sz w:val="20"/>
         </w:rPr>
-        <w:t>Fungal otitis externa.</w:t>
+        <w:t>Episcleritis.</w:t>
       </w:r>
       <w:r>
         <w:rPr>
@@ -30988,7 +31032,7 @@
           <w:i w:val="0"/>
           <w:sz w:val="20"/>
         </w:rPr>
-        <w:t xml:space="preserve"> Prolonged antibiotic use suppresses the bacteria, and Aspergillus niger or Candida albicans then take over as fungal otitis externa.</w:t>
+        <w:t xml:space="preserve"> Inflammation of the superficial episclera is a self-limiting blush with no severe pain and no threat to vision, unlike the deep, emergency inflammation of scleritis.</w:t>
       </w:r>
     </w:p>
     <w:p>
@@ -31002,7 +31046,7 @@
           <w:i w:val="0"/>
           <w:sz w:val="20"/>
         </w:rPr>
-        <w:t>Episcleritis.</w:t>
+        <w:t>Keratitis.</w:t>
       </w:r>
       <w:r>
         <w:rPr>
@@ -31010,51 +31054,7 @@
           <w:i w:val="0"/>
           <w:sz w:val="20"/>
         </w:rPr>
-        <w:t xml:space="preserve"> Inflammation of the superficial episclera is a self-limiting blush with no severe pain and no threat to vision, unlike the deep, emergency inflammation of scleritis.</w:t>
-      </w:r>
-    </w:p>
-    <w:p>
-      <w:pPr>
-        <w:pStyle w:val="ListBullet"/>
-        <w:spacing w:after="40"/>
-      </w:pPr>
-      <w:r>
-        <w:rPr>
-          <w:b/>
-          <w:i w:val="0"/>
-          <w:sz w:val="20"/>
-        </w:rPr>
-        <w:t>Keratitis.</w:t>
-      </w:r>
-      <w:r>
-        <w:rPr>
-          <w:b w:val="0"/>
-          <w:i w:val="0"/>
-          <w:sz w:val="20"/>
-        </w:rPr>
         <w:t xml:space="preserve"> Contact lens wearers carry a Pseudomonas risk. Keratitis is an emergency because it can progress to stromal ulceration, perforation and endophthalmitis.</w:t>
-      </w:r>
-    </w:p>
-    <w:p>
-      <w:pPr>
-        <w:pStyle w:val="ListBullet"/>
-        <w:spacing w:after="40"/>
-      </w:pPr>
-      <w:r>
-        <w:rPr>
-          <w:b/>
-          <w:i w:val="0"/>
-          <w:sz w:val="20"/>
-        </w:rPr>
-        <w:t>Tympanic membrane.</w:t>
-      </w:r>
-      <w:r>
-        <w:rPr>
-          <w:b w:val="0"/>
-          <w:i w:val="0"/>
-          <w:sz w:val="20"/>
-        </w:rPr>
-        <w:t xml:space="preserve"> The tympanic membrane separates the external ear from the middle ear and is the first moving part of the conducting chain, vibrating the ossicles; perforating it causes conductive loss.</w:t>
       </w:r>
     </w:p>
     <w:p>

</xml_diff>